<commit_message>
POLYMORPHISM & INHERITANCE & REPORT UPDATE
Added inheritance by creating a Parent class Vehicle. Bike extends vehicle and electric bike extends bike.

Updated all GUI action methods and ParkingStack class with this inheritance and polymorphism change.

Updated report file with a newer UML Class diagram.
</commit_message>
<xml_diff>
--- a/DSA_CA_24701351.docx
+++ b/DSA_CA_24701351.docx
@@ -163,7 +163,6 @@
             <w:dataBinding w:prefixMappings="xmlns:ns0='http://purl.org/dc/elements/1.1/' xmlns:ns1='http://schemas.openxmlformats.org/package/2006/metadata/core-properties' " w:xpath="/ns1:coreProperties[1]/ns0:subject[1]" w:storeItemID="{6C3C8BC8-F283-45AE-878A-BAB7291924A1}"/>
             <w:text/>
           </w:sdtPr>
-          <w:sdtEndPr/>
           <w:sdtContent>
             <w:p>
               <w:pPr>
@@ -278,7 +277,6 @@
                                     <w:calendar w:val="gregorian"/>
                                   </w:date>
                                 </w:sdtPr>
-                                <w:sdtEndPr/>
                                 <w:sdtContent>
                                   <w:p>
                                     <w:pPr>
@@ -324,7 +322,6 @@
                                     <w:dataBinding w:prefixMappings="xmlns:ns0='http://schemas.openxmlformats.org/officeDocument/2006/extended-properties' " w:xpath="/ns0:Properties[1]/ns0:Company[1]" w:storeItemID="{6668398D-A668-4E3E-A5EB-62B293D839F1}"/>
                                     <w:text/>
                                   </w:sdtPr>
-                                  <w:sdtEndPr/>
                                   <w:sdtContent>
                                     <w:r>
                                       <w:rPr>
@@ -355,7 +352,6 @@
                                     <w:dataBinding w:prefixMappings="xmlns:ns0='http://schemas.microsoft.com/office/2006/coverPageProps' " w:xpath="/ns0:CoverPageProperties[1]/ns0:CompanyAddress[1]" w:storeItemID="{55AF091B-3C7A-41E3-B477-F2FDAA23CFDA}"/>
                                     <w:text/>
                                   </w:sdtPr>
-                                  <w:sdtEndPr/>
                                   <w:sdtContent>
                                     <w:r>
                                       <w:rPr>
@@ -937,14 +933,11 @@
     </w:p>
     <w:p>
       <w:r>
-        <w:rPr>
-          <w:noProof/>
-        </w:rPr>
         <w:drawing>
-          <wp:inline distT="0" distB="0" distL="0" distR="0" wp14:anchorId="1C63DB4B" wp14:editId="2AAECE50">
-            <wp:extent cx="5478449" cy="4561522"/>
-            <wp:effectExtent l="0" t="0" r="8255" b="0"/>
-            <wp:docPr id="1234712997" name="Picture 1"/>
+          <wp:inline distT="0" distB="0" distL="0" distR="0" wp14:anchorId="07859546" wp14:editId="1434FB54">
+            <wp:extent cx="5839485" cy="5300457"/>
+            <wp:effectExtent l="0" t="0" r="8890" b="0"/>
+            <wp:docPr id="1667663070" name="Picture 1"/>
             <wp:cNvGraphicFramePr>
               <a:graphicFrameLocks xmlns:a="http://schemas.openxmlformats.org/drawingml/2006/main" noChangeAspect="1"/>
             </wp:cNvGraphicFramePr>
@@ -952,7 +945,7 @@
               <a:graphicData uri="http://schemas.openxmlformats.org/drawingml/2006/picture">
                 <pic:pic xmlns:pic="http://schemas.openxmlformats.org/drawingml/2006/picture">
                   <pic:nvPicPr>
-                    <pic:cNvPr id="1234712997" name=""/>
+                    <pic:cNvPr id="1667663070" name=""/>
                     <pic:cNvPicPr/>
                   </pic:nvPicPr>
                   <pic:blipFill>
@@ -964,7 +957,7 @@
                   <pic:spPr>
                     <a:xfrm>
                       <a:off x="0" y="0"/>
-                      <a:ext cx="5488461" cy="4569859"/>
+                      <a:ext cx="5850386" cy="5310352"/>
                     </a:xfrm>
                     <a:prstGeom prst="rect">
                       <a:avLst/>
@@ -2162,6 +2155,8 @@
     <w:rsid w:val="008D46A5"/>
     <w:rsid w:val="00A73356"/>
     <w:rsid w:val="00B45D1E"/>
+    <w:rsid w:val="00C35638"/>
+    <w:rsid w:val="00E335BC"/>
   </w:rsids>
   <m:mathPr>
     <m:mathFont m:val="Cambria Math"/>

</xml_diff>